<commit_message>
Table borders: restyle tables in the exported docx (pandoc ignores the reference doc's Table style)
- tools/style-docx-tables.py: post-export patch of the 'Table' style (thin grid, padding,
  bold shaded header), reusing set_table_style from build-reference-doc.py
- make-docx.ps1 runs it after pandoc; reference-paper.docx rebuilt with the same style
- only Tema 3 re-exported; Temas 1 and 2 keep their hand-edited rad.docx
</commit_message>
<xml_diff>
--- a/assets/reference-paper.docx
+++ b/assets/reference-paper.docx
@@ -1026,18 +1026,27 @@
     <w:qFormat/>
     <w:tblPr>
       <w:tblInd w:w="0" w:type="dxa"/>
+      <w:tblBorders>
+        <w:top w:val="single" w:sz="4" w:space="0" w:color="808080"/>
+        <w:left w:val="single" w:sz="4" w:space="0" w:color="808080"/>
+        <w:bottom w:val="single" w:sz="4" w:space="0" w:color="808080"/>
+        <w:right w:val="single" w:sz="4" w:space="0" w:color="808080"/>
+        <w:insideH w:val="single" w:sz="4" w:space="0" w:color="808080"/>
+        <w:insideV w:val="single" w:sz="4" w:space="0" w:color="808080"/>
+      </w:tblBorders>
       <w:tblCellMar>
-        <w:top w:w="0" w:type="dxa"/>
+        <w:top w:w="40" w:type="dxa"/>
         <w:left w:w="108" w:type="dxa"/>
-        <w:bottom w:w="0" w:type="dxa"/>
+        <w:bottom w:w="40" w:type="dxa"/>
         <w:right w:w="108" w:type="dxa"/>
       </w:tblCellMar>
     </w:tblPr>
     <w:tblStylePr w:type="firstRow">
+      <w:rPr>
+        <w:b/>
+      </w:rPr>
       <w:tcPr>
-        <w:tcBorders>
-          <w:bottom w:val="single"/>
-        </w:tcBorders>
+        <w:shd w:val="clear" w:color="auto" w:fill="EDEDED"/>
         <w:vAlign w:val="bottom"/>
       </w:tcPr>
     </w:tblStylePr>

</xml_diff>